<commit_message>
actualizacion a ultima hora del dia
</commit_message>
<xml_diff>
--- a/entorno_desarrollo/Reconocimiento de elementos del desarrollo de software-AdriánTirado.docx
+++ b/entorno_desarrollo/Reconocimiento de elementos del desarrollo de software-AdriánTirado.docx
@@ -14,7 +14,7 @@
         <mc:AlternateContent>
           <mc:Choice Requires="wps">
             <w:drawing>
-              <wp:anchor distT="0" distB="0" distL="114300" distR="114300" simplePos="0" relativeHeight="251666432" behindDoc="1" locked="0" layoutInCell="1" allowOverlap="1" wp14:anchorId="2934EC10" wp14:editId="6E50E818">
+              <wp:anchor distT="0" distB="0" distL="114300" distR="114300" simplePos="0" relativeHeight="251666432" behindDoc="1" locked="0" layoutInCell="1" allowOverlap="1" wp14:anchorId="453E9D77" wp14:editId="0E2BC6C2">
                 <wp:simplePos x="0" y="0"/>
                 <wp:positionH relativeFrom="margin">
                   <wp:posOffset>2763672</wp:posOffset>
@@ -98,7 +98,7 @@
           </mc:Choice>
           <mc:Fallback>
             <w:pict>
-              <v:shapetype w14:anchorId="2934EC10" id="_x0000_t202" coordsize="21600,21600" o:spt="202" path="m,l,21600r21600,l21600,xe">
+              <v:shapetype w14:anchorId="453E9D77" id="_x0000_t202" coordsize="21600,21600" o:spt="202" path="m,l,21600r21600,l21600,xe">
                 <v:stroke joinstyle="miter"/>
                 <v:path gradientshapeok="t" o:connecttype="rect"/>
               </v:shapetype>
@@ -146,7 +146,7 @@
         <mc:AlternateContent>
           <mc:Choice Requires="wps">
             <w:drawing>
-              <wp:anchor distT="0" distB="0" distL="114300" distR="114300" simplePos="0" relativeHeight="251664384" behindDoc="1" locked="0" layoutInCell="1" allowOverlap="1" wp14:anchorId="632A3BAC" wp14:editId="2D86327E">
+              <wp:anchor distT="0" distB="0" distL="114300" distR="114300" simplePos="0" relativeHeight="251664384" behindDoc="1" locked="0" layoutInCell="1" allowOverlap="1" wp14:anchorId="4074C2DD" wp14:editId="5A646F93">
                 <wp:simplePos x="0" y="0"/>
                 <wp:positionH relativeFrom="margin">
                   <wp:align>left</wp:align>
@@ -230,7 +230,7 @@
           </mc:Choice>
           <mc:Fallback>
             <w:pict>
-              <v:shape w14:anchorId="632A3BAC" id="Cuadro de texto 3" o:spid="_x0000_s1027" type="#_x0000_t202" style="position:absolute;margin-left:0;margin-top:561.85pt;width:246.15pt;height:42.8pt;z-index:-251652096;visibility:visible;mso-wrap-style:square;mso-wrap-distance-left:9pt;mso-wrap-distance-top:0;mso-wrap-distance-right:9pt;mso-wrap-distance-bottom:0;mso-position-horizontal:left;mso-position-horizontal-relative:margin;mso-position-vertical:absolute;mso-position-vertical-relative:text;v-text-anchor:top" o:gfxdata="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" filled="f" stroked="f">
+              <v:shape w14:anchorId="4074C2DD" id="Cuadro de texto 3" o:spid="_x0000_s1027" type="#_x0000_t202" style="position:absolute;margin-left:0;margin-top:561.85pt;width:246.15pt;height:42.8pt;z-index:-251652096;visibility:visible;mso-wrap-style:square;mso-wrap-distance-left:9pt;mso-wrap-distance-top:0;mso-wrap-distance-right:9pt;mso-wrap-distance-bottom:0;mso-position-horizontal:left;mso-position-horizontal-relative:margin;mso-position-vertical:absolute;mso-position-vertical-relative:text;v-text-anchor:top" o:gfxdata="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" filled="f" stroked="f">
                 <v:textbox>
                   <w:txbxContent>
                     <w:p>
@@ -274,7 +274,7 @@
         <mc:AlternateContent>
           <mc:Choice Requires="wps">
             <w:drawing>
-              <wp:anchor distT="0" distB="0" distL="114300" distR="114300" simplePos="0" relativeHeight="251662336" behindDoc="1" locked="0" layoutInCell="1" allowOverlap="1" wp14:anchorId="6640182A" wp14:editId="7BE22592">
+              <wp:anchor distT="0" distB="0" distL="114300" distR="114300" simplePos="0" relativeHeight="251662336" behindDoc="1" locked="0" layoutInCell="1" allowOverlap="1" wp14:anchorId="5A194BB1" wp14:editId="1779B7B8">
                 <wp:simplePos x="0" y="0"/>
                 <wp:positionH relativeFrom="margin">
                   <wp:posOffset>2717851</wp:posOffset>
@@ -358,7 +358,7 @@
           </mc:Choice>
           <mc:Fallback>
             <w:pict>
-              <v:shape w14:anchorId="6640182A" id="Cuadro de texto 2" o:spid="_x0000_s1028" type="#_x0000_t202" style="position:absolute;margin-left:214pt;margin-top:46.15pt;width:246.15pt;height:42.8pt;z-index:-251654144;visibility:visible;mso-wrap-style:square;mso-wrap-distance-left:9pt;mso-wrap-distance-top:0;mso-wrap-distance-right:9pt;mso-wrap-distance-bottom:0;mso-position-horizontal:absolute;mso-position-horizontal-relative:margin;mso-position-vertical:absolute;mso-position-vertical-relative:text;v-text-anchor:top" o:gfxdata="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" filled="f" stroked="f">
+              <v:shape w14:anchorId="5A194BB1" id="Cuadro de texto 2" o:spid="_x0000_s1028" type="#_x0000_t202" style="position:absolute;margin-left:214pt;margin-top:46.15pt;width:246.15pt;height:42.8pt;z-index:-251654144;visibility:visible;mso-wrap-style:square;mso-wrap-distance-left:9pt;mso-wrap-distance-top:0;mso-wrap-distance-right:9pt;mso-wrap-distance-bottom:0;mso-position-horizontal:absolute;mso-position-horizontal-relative:margin;mso-position-vertical:absolute;mso-position-vertical-relative:text;v-text-anchor:top" o:gfxdata="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" filled="f" stroked="f">
                 <v:textbox>
                   <w:txbxContent>
                     <w:p>
@@ -408,7 +408,7 @@
             <mc:AlternateContent>
               <mc:Choice Requires="wpg">
                 <w:drawing>
-                  <wp:anchor distT="0" distB="0" distL="114300" distR="114300" simplePos="0" relativeHeight="251659264" behindDoc="1" locked="0" layoutInCell="1" allowOverlap="1" wp14:anchorId="43EBE590">
+                  <wp:anchor distT="0" distB="0" distL="114300" distR="114300" simplePos="0" relativeHeight="251659264" behindDoc="1" locked="0" layoutInCell="1" allowOverlap="1" wp14:anchorId="3389CF55" wp14:editId="48E3C047">
                     <wp:simplePos x="0" y="0"/>
                     <wp:positionH relativeFrom="page">
                       <wp:align>center</wp:align>
@@ -1089,7 +1089,7 @@
               </mc:Choice>
               <mc:Fallback>
                 <w:pict>
-                  <v:group w14:anchorId="43EBE590" id="Grupo 48" o:spid="_x0000_s1029" style="position:absolute;margin-left:0;margin-top:0;width:540pt;height:10in;z-index:-251657216;mso-width-percent:882;mso-height-percent:909;mso-position-horizontal:center;mso-position-horizontal-relative:page;mso-position-vertical:center;mso-position-vertical-relative:page;mso-width-percent:882;mso-height-percent:909" coordsize="68580,91440" o:gfxdata="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">
+                  <v:group w14:anchorId="3389CF55" id="Grupo 48" o:spid="_x0000_s1029" style="position:absolute;margin-left:0;margin-top:0;width:540pt;height:10in;z-index:-251657216;mso-width-percent:882;mso-height-percent:909;mso-position-horizontal:center;mso-position-horizontal-relative:page;mso-position-vertical:center;mso-position-vertical-relative:page;mso-width-percent:882;mso-height-percent:909" coordsize="68580,91440" o:gfxdata="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">
                     <v:group id="Grupo 49" o:spid="_x0000_s1030" style="position:absolute;width:68580;height:91440" coordsize="68580,91440" o:gfxdata="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">
                       <v:rect id="Rectángulo 54" o:spid="_x0000_s1031" style="position:absolute;width:68580;height:91440;visibility:visible;mso-wrap-style:square;v-text-anchor:top" o:gfxdata="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" fillcolor="#485870 [3122]" stroked="f" strokeweight="1pt">
                         <v:fill color2="#3d4b5f [2882]" angle="348" colors="0 #88acbb;6554f #88acbb" focus="100%" type="gradient"/>
@@ -2060,7 +2060,7 @@
         <mc:AlternateContent>
           <mc:Choice Requires="wps">
             <w:drawing>
-              <wp:anchor distT="0" distB="0" distL="114300" distR="114300" simplePos="0" relativeHeight="251667456" behindDoc="0" locked="0" layoutInCell="1" allowOverlap="1">
+              <wp:anchor distT="0" distB="0" distL="114300" distR="114300" simplePos="0" relativeHeight="251667456" behindDoc="0" locked="0" layoutInCell="1" allowOverlap="1" wp14:anchorId="1EFBCF79" wp14:editId="3D531A6B">
                 <wp:simplePos x="0" y="0"/>
                 <wp:positionH relativeFrom="margin">
                   <wp:align>center</wp:align>
@@ -2115,7 +2115,7 @@
           </mc:Choice>
           <mc:Fallback>
             <w:pict>
-              <v:line w14:anchorId="024D3C51" id="Conector recto 4" o:spid="_x0000_s1026" style="position:absolute;z-index:251667456;visibility:visible;mso-wrap-style:square;mso-width-percent:0;mso-height-percent:0;mso-wrap-distance-left:9pt;mso-wrap-distance-top:0;mso-wrap-distance-right:9pt;mso-wrap-distance-bottom:0;mso-position-horizontal:center;mso-position-horizontal-relative:margin;mso-position-vertical:absolute;mso-position-vertical-relative:text;mso-width-percent:0;mso-height-percent:0;mso-width-relative:margin;mso-height-relative:margin" from="0,9.35pt" to="510.25pt,9.35pt" o:gfxdata="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" strokecolor="#4472c4 [3204]" strokeweight=".5pt">
+              <v:line w14:anchorId="58DAC2AD" id="Conector recto 4" o:spid="_x0000_s1026" style="position:absolute;z-index:251667456;visibility:visible;mso-wrap-style:square;mso-width-percent:0;mso-height-percent:0;mso-wrap-distance-left:9pt;mso-wrap-distance-top:0;mso-wrap-distance-right:9pt;mso-wrap-distance-bottom:0;mso-position-horizontal:center;mso-position-horizontal-relative:margin;mso-position-vertical:absolute;mso-position-vertical-relative:text;mso-width-percent:0;mso-height-percent:0;mso-width-relative:margin;mso-height-relative:margin" from="0,9.35pt" to="510.25pt,9.35pt" o:gfxdata="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" strokecolor="#4472c4 [3204]" strokeweight=".5pt">
                 <v:stroke joinstyle="miter"/>
                 <w10:wrap anchorx="margin"/>
               </v:line>
@@ -2195,7 +2195,7 @@
           <w:noProof/>
         </w:rPr>
         <w:drawing>
-          <wp:inline distT="0" distB="0" distL="0" distR="0">
+          <wp:inline distT="0" distB="0" distL="0" distR="0" wp14:anchorId="38293CF5" wp14:editId="211464CA">
             <wp:extent cx="2164701" cy="1571154"/>
             <wp:effectExtent l="0" t="0" r="7620" b="0"/>
             <wp:docPr id="16" name="Imagen 16" descr="Resultado de imagen de persona habla cliente"/>
@@ -2265,7 +2265,7 @@
           <w:noProof/>
         </w:rPr>
         <w:drawing>
-          <wp:inline distT="0" distB="0" distL="0" distR="0">
+          <wp:inline distT="0" distB="0" distL="0" distR="0" wp14:anchorId="266B4E6F" wp14:editId="7DACC2E0">
             <wp:extent cx="2495550" cy="2571750"/>
             <wp:effectExtent l="0" t="0" r="0" b="0"/>
             <wp:docPr id="18" name="Imagen 18" descr="C:\Users\1DAW\AppData\Local\Microsoft\Windows\INetCache\Content.MSO\3FF81942.tmp"/>
@@ -2319,7 +2319,13 @@
         <w:pStyle w:val="Texto"/>
       </w:pPr>
       <w:r>
-        <w:t xml:space="preserve">El director de equipo decide que el mejor método para este proyecto será </w:t>
+        <w:t>El director de equipo decide que el mejor método para este proyecto será</w:t>
+      </w:r>
+      <w:r>
+        <w:t>:</w:t>
+      </w:r>
+      <w:r>
+        <w:t xml:space="preserve"> </w:t>
       </w:r>
       <w:r>
         <w:rPr>
@@ -2328,7 +2334,10 @@
         <w:t>En cascada</w:t>
       </w:r>
       <w:r>
-        <w:t>, Me</w:t>
+        <w:t>.</w:t>
+      </w:r>
+      <w:r>
+        <w:t xml:space="preserve"> Me</w:t>
       </w:r>
       <w:r>
         <w:t xml:space="preserve"> bas</w:t>
@@ -2346,7 +2355,15 @@
         <w:t>para seguir un enfoque más tradicional de desarrollo de software</w:t>
       </w:r>
       <w:r>
-        <w:t xml:space="preserve"> ya que no será necesario muchas reuniones para captar las necesidades del software.</w:t>
+        <w:t xml:space="preserve"> ya que no será necesario muchas reuniones para captar las necesidades del software</w:t>
+      </w:r>
+      <w:r>
+        <w:t xml:space="preserve"> y la entrega será más inmediata</w:t>
+      </w:r>
+      <w:bookmarkStart w:id="3" w:name="_GoBack"/>
+      <w:bookmarkEnd w:id="3"/>
+      <w:r>
+        <w:t>.</w:t>
       </w:r>
     </w:p>
     <w:p>
@@ -2373,12 +2390,12 @@
       <w:pPr>
         <w:pStyle w:val="Ttulo2"/>
       </w:pPr>
-      <w:bookmarkStart w:id="3" w:name="_Toc147779517"/>
+      <w:bookmarkStart w:id="4" w:name="_Toc147779517"/>
       <w:r>
         <w:lastRenderedPageBreak/>
         <w:t>Fase de análisis</w:t>
       </w:r>
-      <w:bookmarkEnd w:id="3"/>
+      <w:bookmarkEnd w:id="4"/>
     </w:p>
     <w:p>
       <w:pPr>
@@ -2401,7 +2418,7 @@
           <w:noProof/>
         </w:rPr>
         <w:drawing>
-          <wp:anchor distT="0" distB="0" distL="114300" distR="114300" simplePos="0" relativeHeight="251668480" behindDoc="0" locked="0" layoutInCell="1" allowOverlap="1">
+          <wp:anchor distT="0" distB="0" distL="114300" distR="114300" simplePos="0" relativeHeight="251668480" behindDoc="0" locked="0" layoutInCell="1" allowOverlap="1" wp14:anchorId="67BD014F" wp14:editId="58E8304E">
             <wp:simplePos x="0" y="0"/>
             <wp:positionH relativeFrom="page">
               <wp:posOffset>825500</wp:posOffset>
@@ -2567,7 +2584,7 @@
           <w:noProof/>
         </w:rPr>
         <w:drawing>
-          <wp:inline distT="0" distB="0" distL="0" distR="0">
+          <wp:inline distT="0" distB="0" distL="0" distR="0" wp14:anchorId="5E91FCCC" wp14:editId="219BFD7F">
             <wp:extent cx="1912526" cy="1809750"/>
             <wp:effectExtent l="0" t="0" r="0" b="0"/>
             <wp:docPr id="13" name="Imagen 13" descr="C:\Users\1DAW\AppData\Local\Microsoft\Windows\INetCache\Content.MSO\35C61AAA.tmp"/>
@@ -2623,7 +2640,7 @@
           <w:noProof/>
         </w:rPr>
         <w:drawing>
-          <wp:inline distT="0" distB="0" distL="0" distR="0">
+          <wp:inline distT="0" distB="0" distL="0" distR="0" wp14:anchorId="7858AD60" wp14:editId="7D003D93">
             <wp:extent cx="1771650" cy="1771650"/>
             <wp:effectExtent l="0" t="0" r="0" b="0"/>
             <wp:docPr id="14" name="Imagen 14" descr="C:\Users\1DAW\AppData\Local\Microsoft\Windows\INetCache\Content.MSO\CCA61848.tmp"/>
@@ -2679,7 +2696,7 @@
           <w:noProof/>
         </w:rPr>
         <w:drawing>
-          <wp:inline distT="0" distB="0" distL="0" distR="0">
+          <wp:inline distT="0" distB="0" distL="0" distR="0" wp14:anchorId="0D471A6E" wp14:editId="7BCDA255">
             <wp:extent cx="1501140" cy="1501140"/>
             <wp:effectExtent l="0" t="0" r="3810" b="3810"/>
             <wp:docPr id="15" name="Imagen 15" descr="VEVOR Impresora Térmica de Ticket 58 mm Impresora Térmica Recibos ESC/POS USB Impresora Térmica Impresora térmica de Recibos Impresora Térmica Inalámbrica 193 x 136 x 122 mm Impresora Portátil"/>
@@ -2750,7 +2767,7 @@
           <w:noProof/>
         </w:rPr>
         <w:drawing>
-          <wp:inline distT="0" distB="0" distL="0" distR="0">
+          <wp:inline distT="0" distB="0" distL="0" distR="0" wp14:anchorId="1AD995CF" wp14:editId="2854F4A7">
             <wp:extent cx="3206750" cy="2132594"/>
             <wp:effectExtent l="0" t="0" r="0" b="1270"/>
             <wp:docPr id="19" name="Imagen 19" descr="C:\Users\1DAW\AppData\Local\Microsoft\Windows\INetCache\Content.MSO\D865CAA0.tmp"/>
@@ -2806,12 +2823,12 @@
       <w:pPr>
         <w:pStyle w:val="Ttulo2"/>
       </w:pPr>
-      <w:bookmarkStart w:id="4" w:name="_Toc147779518"/>
+      <w:bookmarkStart w:id="5" w:name="_Toc147779518"/>
       <w:r>
         <w:lastRenderedPageBreak/>
         <w:t>Fase De Diseño</w:t>
       </w:r>
-      <w:bookmarkEnd w:id="4"/>
+      <w:bookmarkEnd w:id="5"/>
     </w:p>
     <w:p>
       <w:pPr>
@@ -2819,6 +2836,15 @@
       </w:pPr>
       <w:r>
         <w:t>Tras el visto bueno del cliente, El director y el cliente firman el contrato y comienza el desarrollo de la página web</w:t>
+      </w:r>
+      <w:r>
+        <w:t>,</w:t>
+      </w:r>
+      <w:r>
+        <w:t xml:space="preserve"> con un tiempo límite establecido</w:t>
+      </w:r>
+      <w:r>
+        <w:t xml:space="preserve"> el director decide preparar el producto en un margen de 2 días.</w:t>
       </w:r>
     </w:p>
     <w:p>
@@ -2915,7 +2941,7 @@
           <w:noProof/>
         </w:rPr>
         <w:drawing>
-          <wp:inline distT="0" distB="0" distL="0" distR="0">
+          <wp:inline distT="0" distB="0" distL="0" distR="0" wp14:anchorId="5E3A64F6" wp14:editId="01401759">
             <wp:extent cx="4076700" cy="3187381"/>
             <wp:effectExtent l="0" t="0" r="0" b="0"/>
             <wp:docPr id="20" name="Imagen 20" descr="Resultado de imagen de fase diseño proyecto web"/>
@@ -2971,12 +2997,12 @@
       <w:pPr>
         <w:pStyle w:val="Ttulo2"/>
       </w:pPr>
-      <w:bookmarkStart w:id="5" w:name="_Toc147779519"/>
+      <w:bookmarkStart w:id="6" w:name="_Toc147779519"/>
       <w:r>
         <w:lastRenderedPageBreak/>
         <w:t>Fase Implementación</w:t>
       </w:r>
-      <w:bookmarkEnd w:id="5"/>
+      <w:bookmarkEnd w:id="6"/>
     </w:p>
     <w:p>
       <w:pPr>
@@ -3003,7 +3029,7 @@
           <w:noProof/>
         </w:rPr>
         <w:drawing>
-          <wp:inline distT="0" distB="0" distL="0" distR="0" wp14:anchorId="7BF03C7A">
+          <wp:inline distT="0" distB="0" distL="0" distR="0" wp14:anchorId="12CC6CFA" wp14:editId="477D7CC7">
             <wp:extent cx="5375275" cy="2749836"/>
             <wp:effectExtent l="0" t="0" r="0" b="0"/>
             <wp:docPr id="9" name="Imagen 9"/>
@@ -3073,12 +3099,12 @@
       <w:pPr>
         <w:pStyle w:val="Ttulo2"/>
       </w:pPr>
-      <w:bookmarkStart w:id="6" w:name="_Toc147779520"/>
+      <w:bookmarkStart w:id="7" w:name="_Toc147779520"/>
       <w:r>
         <w:lastRenderedPageBreak/>
         <w:t>Fase de Pruebas</w:t>
       </w:r>
-      <w:bookmarkEnd w:id="6"/>
+      <w:bookmarkEnd w:id="7"/>
     </w:p>
     <w:p>
       <w:pPr>
@@ -3097,7 +3123,7 @@
           <w:noProof/>
         </w:rPr>
         <w:drawing>
-          <wp:inline distT="0" distB="0" distL="0" distR="0">
+          <wp:inline distT="0" distB="0" distL="0" distR="0" wp14:anchorId="3428A7FC" wp14:editId="16C14DDC">
             <wp:extent cx="5168900" cy="2762563"/>
             <wp:effectExtent l="0" t="0" r="0" b="0"/>
             <wp:docPr id="10" name="Imagen 10" descr="C:\Users\1DAW\AppData\Local\Microsoft\Windows\INetCache\Content.MSO\349EBC31.tmp"/>
@@ -3170,7 +3196,7 @@
       <w:pPr>
         <w:pStyle w:val="Ttulo2"/>
       </w:pPr>
-      <w:bookmarkStart w:id="7" w:name="_Toc147779521"/>
+      <w:bookmarkStart w:id="8" w:name="_Toc147779521"/>
       <w:r>
         <w:lastRenderedPageBreak/>
         <w:t xml:space="preserve">Fase de </w:t>
@@ -3181,7 +3207,7 @@
       <w:r>
         <w:t>xplotación</w:t>
       </w:r>
-      <w:bookmarkEnd w:id="7"/>
+      <w:bookmarkEnd w:id="8"/>
     </w:p>
     <w:p>
       <w:pPr>
@@ -3198,8 +3224,6 @@
       <w:pPr>
         <w:pStyle w:val="Texto"/>
       </w:pPr>
-      <w:bookmarkStart w:id="8" w:name="_GoBack"/>
-      <w:bookmarkEnd w:id="8"/>
     </w:p>
     <w:p>
       <w:pPr>
@@ -3232,7 +3256,7 @@
           <w:noProof/>
         </w:rPr>
         <w:drawing>
-          <wp:inline distT="0" distB="0" distL="0" distR="0">
+          <wp:inline distT="0" distB="0" distL="0" distR="0" wp14:anchorId="37B14ABC" wp14:editId="278CED9C">
             <wp:extent cx="4136390" cy="2262088"/>
             <wp:effectExtent l="0" t="0" r="0" b="5080"/>
             <wp:docPr id="11" name="Imagen 11" descr="Resultado de imagen de github control versiones"/>
@@ -4943,7 +4967,7 @@
 </file>
 
 <file path=customXml/itemProps1.xml><?xml version="1.0" encoding="utf-8"?>
-<ds:datastoreItem xmlns:ds="http://schemas.openxmlformats.org/officeDocument/2006/customXml" ds:itemID="{D5912024-ADA1-4867-AD1D-4CC83947B739}">
+<ds:datastoreItem xmlns:ds="http://schemas.openxmlformats.org/officeDocument/2006/customXml" ds:itemID="{D0612E31-7DEC-4F9F-9E59-0B4D705CD16C}">
   <ds:schemaRefs>
     <ds:schemaRef ds:uri="http://schemas.openxmlformats.org/officeDocument/2006/bibliography"/>
   </ds:schemaRefs>

</xml_diff>